<commit_message>
add link repo in PDF file
</commit_message>
<xml_diff>
--- a/JONATHAN LUDENA - EJERCICIO PRACTICO.docx
+++ b/JONATHAN LUDENA - EJERCICIO PRACTICO.docx
@@ -131,6 +131,22 @@
     </w:p>
     <w:p>
       <w:pPr>
+        <w:jc w:val="center"/>
+      </w:pPr>
+      <w:r>
+        <w:t xml:space="preserve">Repositorio: </w:t>
+      </w:r>
+      <w:hyperlink r:id="rId6" w:history="1">
+        <w:r>
+          <w:rPr>
+            <w:rStyle w:val="Hipervnculo"/>
+          </w:rPr>
+          <w:t>https://github.com/jonathanludena/arq-design-may2026-AS-JL</w:t>
+        </w:r>
+      </w:hyperlink>
+    </w:p>
+    <w:p>
+      <w:pPr>
         <w:rPr>
           <w:sz w:val="44"/>
           <w:szCs w:val="44"/>
@@ -147,7 +163,13 @@
     <w:sdt>
       <w:sdtPr>
         <w:rPr>
-          <w:lang w:val="es-MX"/>
+          <w:rFonts w:asciiTheme="minorHAnsi" w:eastAsiaTheme="minorHAnsi" w:hAnsiTheme="minorHAnsi" w:cstheme="minorBidi"/>
+          <w:color w:val="auto"/>
+          <w:kern w:val="2"/>
+          <w:sz w:val="24"/>
+          <w:szCs w:val="24"/>
+          <w:lang w:val="es-MX" w:eastAsia="en-US"/>
+          <w14:ligatures w14:val="standardContextual"/>
         </w:rPr>
         <w:id w:val="-1314639042"/>
         <w:docPartObj>
@@ -157,15 +179,8 @@
       </w:sdtPr>
       <w:sdtEndPr>
         <w:rPr>
-          <w:rFonts w:asciiTheme="minorHAnsi" w:eastAsiaTheme="minorHAnsi" w:hAnsiTheme="minorHAnsi" w:cstheme="minorBidi"/>
           <w:b/>
           <w:bCs/>
-          <w:color w:val="auto"/>
-          <w:kern w:val="2"/>
-          <w:sz w:val="24"/>
-          <w:szCs w:val="24"/>
-          <w:lang w:eastAsia="en-US"/>
-          <w14:ligatures w14:val="standardContextual"/>
         </w:rPr>
       </w:sdtEndPr>
       <w:sdtContent>
@@ -3680,8 +3695,14 @@
               <w:spacing w:before="120" w:after="120"/>
               <w:jc w:val="center"/>
               <w:cnfStyle w:val="000000000000" w:firstRow="0" w:lastRow="0" w:firstColumn="0" w:lastColumn="0" w:oddVBand="0" w:evenVBand="0" w:oddHBand="0" w:evenHBand="0" w:firstRowFirstColumn="0" w:firstRowLastColumn="0" w:lastRowFirstColumn="0" w:lastRowLastColumn="0"/>
-            </w:pPr>
-            <w:r>
+              <w:rPr>
+                <w:lang w:val="en-US"/>
+              </w:rPr>
+            </w:pPr>
+            <w:r>
+              <w:rPr>
+                <w:lang w:val="en-US"/>
+              </w:rPr>
               <w:t>Azure WAF en Front Door</w:t>
             </w:r>
           </w:p>
@@ -3869,8 +3890,14 @@
               <w:spacing w:before="120" w:after="120"/>
               <w:jc w:val="center"/>
               <w:cnfStyle w:val="000000100000" w:firstRow="0" w:lastRow="0" w:firstColumn="0" w:lastColumn="0" w:oddVBand="0" w:evenVBand="0" w:oddHBand="1" w:evenHBand="0" w:firstRowFirstColumn="0" w:firstRowLastColumn="0" w:lastRowFirstColumn="0" w:lastRowLastColumn="0"/>
-            </w:pPr>
-            <w:r>
+              <w:rPr>
+                <w:lang w:val="en-US"/>
+              </w:rPr>
+            </w:pPr>
+            <w:r>
+              <w:rPr>
+                <w:lang w:val="en-US"/>
+              </w:rPr>
               <w:t>Azure Cache for Redis Enterprise</w:t>
             </w:r>
           </w:p>
@@ -3944,8 +3971,14 @@
               <w:spacing w:before="120" w:after="120"/>
               <w:jc w:val="center"/>
               <w:cnfStyle w:val="000000100000" w:firstRow="0" w:lastRow="0" w:firstColumn="0" w:lastColumn="0" w:oddVBand="0" w:evenVBand="0" w:oddHBand="1" w:evenHBand="0" w:firstRowFirstColumn="0" w:firstRowLastColumn="0" w:lastRowFirstColumn="0" w:lastRowLastColumn="0"/>
-            </w:pPr>
-            <w:r>
+              <w:rPr>
+                <w:lang w:val="en-US"/>
+              </w:rPr>
+            </w:pPr>
+            <w:r>
+              <w:rPr>
+                <w:lang w:val="en-US"/>
+              </w:rPr>
               <w:t>Azure SQL Ledger o Azure Confidential Ledger</w:t>
             </w:r>
           </w:p>
@@ -4019,31 +4052,16 @@
               <w:spacing w:before="120" w:after="120"/>
               <w:jc w:val="center"/>
               <w:cnfStyle w:val="000000100000" w:firstRow="0" w:lastRow="0" w:firstColumn="0" w:lastColumn="0" w:oddVBand="0" w:evenVBand="0" w:oddHBand="1" w:evenHBand="0" w:firstRowFirstColumn="0" w:firstRowLastColumn="0" w:lastRowFirstColumn="0" w:lastRowLastColumn="0"/>
-            </w:pPr>
-            <w:r>
-              <w:t xml:space="preserve">Azure Monitor + </w:t>
-            </w:r>
-            <w:proofErr w:type="spellStart"/>
-            <w:r>
-              <w:t>Application</w:t>
-            </w:r>
-            <w:proofErr w:type="spellEnd"/>
-            <w:r>
-              <w:t xml:space="preserve"> </w:t>
-            </w:r>
-            <w:proofErr w:type="spellStart"/>
-            <w:r>
-              <w:t>Insights</w:t>
-            </w:r>
-            <w:proofErr w:type="spellEnd"/>
-            <w:r>
-              <w:t xml:space="preserve"> + Log </w:t>
-            </w:r>
-            <w:proofErr w:type="spellStart"/>
-            <w:r>
-              <w:t>Analytics</w:t>
-            </w:r>
-            <w:proofErr w:type="spellEnd"/>
+              <w:rPr>
+                <w:lang w:val="en-US"/>
+              </w:rPr>
+            </w:pPr>
+            <w:r>
+              <w:rPr>
+                <w:lang w:val="en-US"/>
+              </w:rPr>
+              <w:t>Azure Monitor + Application Insights + Log Analytics</w:t>
+            </w:r>
           </w:p>
         </w:tc>
       </w:tr>
@@ -4076,17 +4094,15 @@
               <w:spacing w:before="120" w:after="120"/>
               <w:jc w:val="center"/>
               <w:cnfStyle w:val="000000000000" w:firstRow="0" w:lastRow="0" w:firstColumn="0" w:lastColumn="0" w:oddVBand="0" w:evenVBand="0" w:oddHBand="0" w:evenHBand="0" w:firstRowFirstColumn="0" w:firstRowLastColumn="0" w:lastRowFirstColumn="0" w:lastRowLastColumn="0"/>
-            </w:pPr>
-            <w:r>
-              <w:t xml:space="preserve">GitHub </w:t>
-            </w:r>
-            <w:proofErr w:type="spellStart"/>
-            <w:r>
-              <w:t>Actions</w:t>
-            </w:r>
-            <w:proofErr w:type="spellEnd"/>
-            <w:r>
-              <w:t xml:space="preserve"> o Azure DevOps</w:t>
+              <w:rPr>
+                <w:lang w:val="en-US"/>
+              </w:rPr>
+            </w:pPr>
+            <w:r>
+              <w:rPr>
+                <w:lang w:val="en-US"/>
+              </w:rPr>
+              <w:t>GitHub Actions o Azure DevOps</w:t>
             </w:r>
           </w:p>
         </w:tc>
@@ -4159,17 +4175,15 @@
               <w:spacing w:before="120" w:after="120"/>
               <w:jc w:val="center"/>
               <w:cnfStyle w:val="000000000000" w:firstRow="0" w:lastRow="0" w:firstColumn="0" w:lastColumn="0" w:oddVBand="0" w:evenVBand="0" w:oddHBand="0" w:evenHBand="0" w:firstRowFirstColumn="0" w:firstRowLastColumn="0" w:lastRowFirstColumn="0" w:lastRowLastColumn="0"/>
-            </w:pPr>
-            <w:r>
-              <w:t xml:space="preserve">Private </w:t>
-            </w:r>
-            <w:proofErr w:type="gramStart"/>
-            <w:r>
-              <w:t>Link</w:t>
-            </w:r>
-            <w:proofErr w:type="gramEnd"/>
-            <w:r>
-              <w:t>, VNet Integration, NSG, Azure Firewall</w:t>
+              <w:rPr>
+                <w:lang w:val="en-US"/>
+              </w:rPr>
+            </w:pPr>
+            <w:r>
+              <w:rPr>
+                <w:lang w:val="en-US"/>
+              </w:rPr>
+              <w:t>Private Link, VNet Integration, NSG, Azure Firewall</w:t>
             </w:r>
           </w:p>
         </w:tc>
@@ -4596,14 +4610,7 @@
           <w:sz w:val="22"/>
           <w:szCs w:val="22"/>
         </w:rPr>
-        <w:t xml:space="preserve"> </w:t>
-      </w:r>
-      <w:r>
-        <w:rPr>
-          <w:sz w:val="22"/>
-          <w:szCs w:val="22"/>
-        </w:rPr>
-        <w:t xml:space="preserve">gestionarse cuidadosamente en un entorno financiero. </w:t>
+        <w:t xml:space="preserve"> gestionarse cuidadosamente en un entorno financiero. </w:t>
       </w:r>
       <w:r>
         <w:rPr>
@@ -5412,14 +5419,34 @@
         <w:rPr>
           <w:sz w:val="22"/>
           <w:szCs w:val="22"/>
-        </w:rPr>
-      </w:pPr>
-      <w:r>
-        <w:rPr>
-          <w:sz w:val="22"/>
-          <w:szCs w:val="22"/>
-        </w:rPr>
-        <w:t xml:space="preserve">API Management valida </w:t>
+          <w:lang w:val="en-US"/>
+        </w:rPr>
+      </w:pPr>
+      <w:r>
+        <w:rPr>
+          <w:sz w:val="22"/>
+          <w:szCs w:val="22"/>
+          <w:lang w:val="en-US"/>
+        </w:rPr>
+        <w:t xml:space="preserve">API Management </w:t>
+      </w:r>
+      <w:proofErr w:type="spellStart"/>
+      <w:r>
+        <w:rPr>
+          <w:sz w:val="22"/>
+          <w:szCs w:val="22"/>
+          <w:lang w:val="en-US"/>
+        </w:rPr>
+        <w:t>valida</w:t>
+      </w:r>
+      <w:proofErr w:type="spellEnd"/>
+      <w:r>
+        <w:rPr>
+          <w:sz w:val="22"/>
+          <w:szCs w:val="22"/>
+          <w:lang w:val="en-US"/>
+        </w:rPr>
+        <w:t xml:space="preserve"> </w:t>
       </w:r>
       <w:r>
         <w:rPr>
@@ -5427,6 +5454,7 @@
           <w:iCs/>
           <w:sz w:val="22"/>
           <w:szCs w:val="22"/>
+          <w:lang w:val="en-US"/>
         </w:rPr>
         <w:t>JWT</w:t>
       </w:r>
@@ -5434,74 +5462,74 @@
         <w:rPr>
           <w:sz w:val="22"/>
           <w:szCs w:val="22"/>
+          <w:lang w:val="en-US"/>
         </w:rPr>
         <w:t xml:space="preserve">, </w:t>
       </w:r>
-      <w:proofErr w:type="spellStart"/>
       <w:r>
         <w:rPr>
           <w:i/>
           <w:iCs/>
           <w:sz w:val="22"/>
           <w:szCs w:val="22"/>
+          <w:lang w:val="en-US"/>
         </w:rPr>
         <w:t>scopes</w:t>
       </w:r>
-      <w:proofErr w:type="spellEnd"/>
-      <w:r>
-        <w:rPr>
-          <w:sz w:val="22"/>
-          <w:szCs w:val="22"/>
+      <w:r>
+        <w:rPr>
+          <w:sz w:val="22"/>
+          <w:szCs w:val="22"/>
+          <w:lang w:val="en-US"/>
         </w:rPr>
         <w:t xml:space="preserve">, </w:t>
       </w:r>
-      <w:proofErr w:type="spellStart"/>
       <w:r>
         <w:rPr>
           <w:i/>
           <w:iCs/>
           <w:sz w:val="22"/>
           <w:szCs w:val="22"/>
+          <w:lang w:val="en-US"/>
         </w:rPr>
         <w:t>audience</w:t>
       </w:r>
-      <w:proofErr w:type="spellEnd"/>
-      <w:r>
-        <w:rPr>
-          <w:sz w:val="22"/>
-          <w:szCs w:val="22"/>
+      <w:r>
+        <w:rPr>
+          <w:sz w:val="22"/>
+          <w:szCs w:val="22"/>
+          <w:lang w:val="en-US"/>
         </w:rPr>
         <w:t xml:space="preserve">, </w:t>
       </w:r>
-      <w:proofErr w:type="spellStart"/>
       <w:r>
         <w:rPr>
           <w:i/>
           <w:iCs/>
           <w:sz w:val="22"/>
           <w:szCs w:val="22"/>
+          <w:lang w:val="en-US"/>
         </w:rPr>
         <w:t>issuer</w:t>
       </w:r>
-      <w:proofErr w:type="spellEnd"/>
-      <w:r>
-        <w:rPr>
-          <w:sz w:val="22"/>
-          <w:szCs w:val="22"/>
+      <w:r>
+        <w:rPr>
+          <w:sz w:val="22"/>
+          <w:szCs w:val="22"/>
+          <w:lang w:val="en-US"/>
         </w:rPr>
         <w:t xml:space="preserve"> y </w:t>
       </w:r>
-      <w:proofErr w:type="spellStart"/>
       <w:r>
         <w:rPr>
           <w:i/>
           <w:iCs/>
           <w:sz w:val="22"/>
           <w:szCs w:val="22"/>
+          <w:lang w:val="en-US"/>
         </w:rPr>
         <w:t>claims</w:t>
       </w:r>
-      <w:proofErr w:type="spellEnd"/>
     </w:p>
     <w:p>
       <w:pPr>
@@ -5689,14 +5717,62 @@
         <w:rPr>
           <w:sz w:val="22"/>
           <w:szCs w:val="22"/>
-        </w:rPr>
-      </w:pPr>
-      <w:r>
-        <w:rPr>
-          <w:sz w:val="22"/>
-          <w:szCs w:val="22"/>
-        </w:rPr>
-        <w:t xml:space="preserve">Operaciones sensibles requiere </w:t>
+          <w:lang w:val="en-US"/>
+        </w:rPr>
+      </w:pPr>
+      <w:proofErr w:type="spellStart"/>
+      <w:r>
+        <w:rPr>
+          <w:sz w:val="22"/>
+          <w:szCs w:val="22"/>
+          <w:lang w:val="en-US"/>
+        </w:rPr>
+        <w:t>Operaciones</w:t>
+      </w:r>
+      <w:proofErr w:type="spellEnd"/>
+      <w:r>
+        <w:rPr>
+          <w:sz w:val="22"/>
+          <w:szCs w:val="22"/>
+          <w:lang w:val="en-US"/>
+        </w:rPr>
+        <w:t xml:space="preserve"> </w:t>
+      </w:r>
+      <w:proofErr w:type="spellStart"/>
+      <w:r>
+        <w:rPr>
+          <w:sz w:val="22"/>
+          <w:szCs w:val="22"/>
+          <w:lang w:val="en-US"/>
+        </w:rPr>
+        <w:t>sensibles</w:t>
+      </w:r>
+      <w:proofErr w:type="spellEnd"/>
+      <w:r>
+        <w:rPr>
+          <w:sz w:val="22"/>
+          <w:szCs w:val="22"/>
+          <w:lang w:val="en-US"/>
+        </w:rPr>
+        <w:t xml:space="preserve"> </w:t>
+      </w:r>
+      <w:proofErr w:type="spellStart"/>
+      <w:r>
+        <w:rPr>
+          <w:sz w:val="22"/>
+          <w:szCs w:val="22"/>
+          <w:lang w:val="en-US"/>
+        </w:rPr>
+        <w:t>requiere</w:t>
+      </w:r>
+      <w:proofErr w:type="spellEnd"/>
+      <w:r>
+        <w:rPr>
+          <w:sz w:val="22"/>
+          <w:szCs w:val="22"/>
+          <w:lang w:val="en-US"/>
+        </w:rPr>
+        <w:t xml:space="preserve"> </w:t>
       </w:r>
       <w:r>
         <w:rPr>
@@ -5704,20 +5780,20 @@
           <w:iCs/>
           <w:sz w:val="22"/>
           <w:szCs w:val="22"/>
+          <w:lang w:val="en-US"/>
         </w:rPr>
         <w:t xml:space="preserve">step-up </w:t>
       </w:r>
-      <w:proofErr w:type="spellStart"/>
       <w:r>
         <w:rPr>
           <w:i/>
           <w:iCs/>
           <w:sz w:val="22"/>
           <w:szCs w:val="22"/>
+          <w:lang w:val="en-US"/>
         </w:rPr>
         <w:t>authentication</w:t>
       </w:r>
-      <w:proofErr w:type="spellEnd"/>
     </w:p>
     <w:p>
       <w:pPr>
@@ -5803,10 +5879,7 @@
         <w:t>Onboarding con reconocimiento fácil y KYC</w:t>
       </w:r>
       <w:r>
-        <w:t xml:space="preserve"> </w:t>
-      </w:r>
-      <w:r>
-        <w:t>(</w:t>
+        <w:t xml:space="preserve"> (</w:t>
       </w:r>
       <w:r>
         <w:rPr>
@@ -7147,14 +7220,26 @@
               <w:rPr>
                 <w:sz w:val="22"/>
                 <w:szCs w:val="22"/>
-              </w:rPr>
-            </w:pPr>
+                <w:lang w:val="en-US"/>
+              </w:rPr>
+            </w:pPr>
+            <w:proofErr w:type="spellStart"/>
             <w:r>
               <w:rPr>
                 <w:sz w:val="22"/>
                 <w:szCs w:val="22"/>
-              </w:rPr>
-              <w:t>Envío de email, SMS, push, WhatsApp</w:t>
+                <w:lang w:val="en-US"/>
+              </w:rPr>
+              <w:t>Envío</w:t>
+            </w:r>
+            <w:proofErr w:type="spellEnd"/>
+            <w:r>
+              <w:rPr>
+                <w:sz w:val="22"/>
+                <w:szCs w:val="22"/>
+                <w:lang w:val="en-US"/>
+              </w:rPr>
+              <w:t xml:space="preserve"> de email, SMS, push, WhatsApp</w:t>
             </w:r>
           </w:p>
         </w:tc>
@@ -10066,12 +10151,37 @@
     <w:p>
       <w:pPr>
         <w:pStyle w:val="Ttulo3"/>
+        <w:rPr>
+          <w:lang w:val="en-US"/>
+        </w:rPr>
       </w:pPr>
       <w:bookmarkStart w:id="21" w:name="_Toc229012152"/>
-      <w:r>
-        <w:t>Patrón recomendado</w:t>
-      </w:r>
-      <w:r>
+      <w:proofErr w:type="spellStart"/>
+      <w:r>
+        <w:rPr>
+          <w:lang w:val="en-US"/>
+        </w:rPr>
+        <w:t>Patrón</w:t>
+      </w:r>
+      <w:proofErr w:type="spellEnd"/>
+      <w:r>
+        <w:rPr>
+          <w:lang w:val="en-US"/>
+        </w:rPr>
+        <w:t xml:space="preserve"> </w:t>
+      </w:r>
+      <w:proofErr w:type="spellStart"/>
+      <w:r>
+        <w:rPr>
+          <w:lang w:val="en-US"/>
+        </w:rPr>
+        <w:t>recomendado</w:t>
+      </w:r>
+      <w:proofErr w:type="spellEnd"/>
+      <w:r>
+        <w:rPr>
+          <w:lang w:val="en-US"/>
+        </w:rPr>
         <w:t>:</w:t>
       </w:r>
       <w:bookmarkEnd w:id="21"/>
@@ -15530,6 +15640,9 @@
       </w:pPr>
       <w:bookmarkStart w:id="36" w:name="_Toc229012167"/>
       <w:r>
+        <w:rPr>
+          <w:noProof/>
+        </w:rPr>
         <w:lastRenderedPageBreak/>
         <w:drawing>
           <wp:anchor distT="0" distB="0" distL="114300" distR="114300" simplePos="0" relativeHeight="251658240" behindDoc="1" locked="0" layoutInCell="1" allowOverlap="1" wp14:anchorId="7BB51049" wp14:editId="6B343015">
@@ -15555,7 +15668,7 @@
                     <pic:cNvPicPr/>
                   </pic:nvPicPr>
                   <pic:blipFill>
-                    <a:blip r:embed="rId6" cstate="print">
+                    <a:blip r:embed="rId7" cstate="print">
                       <a:extLst>
                         <a:ext uri="{28A0092B-C50C-407E-A947-70E740481C1C}">
                           <a14:useLocalDpi xmlns:a14="http://schemas.microsoft.com/office/drawing/2010/main" val="0"/>
@@ -15617,6 +15730,9 @@
       </w:pPr>
       <w:bookmarkStart w:id="37" w:name="_Toc229012168"/>
       <w:r>
+        <w:rPr>
+          <w:noProof/>
+        </w:rPr>
         <w:lastRenderedPageBreak/>
         <w:drawing>
           <wp:anchor distT="0" distB="0" distL="114300" distR="114300" simplePos="0" relativeHeight="251661312" behindDoc="1" locked="0" layoutInCell="1" allowOverlap="1" wp14:anchorId="22853988" wp14:editId="0532A0E7">
@@ -15642,7 +15758,7 @@
                     <pic:cNvPicPr/>
                   </pic:nvPicPr>
                   <pic:blipFill>
-                    <a:blip r:embed="rId7" cstate="print">
+                    <a:blip r:embed="rId8" cstate="print">
                       <a:extLst>
                         <a:ext uri="{28A0092B-C50C-407E-A947-70E740481C1C}">
                           <a14:useLocalDpi xmlns:a14="http://schemas.microsoft.com/office/drawing/2010/main" val="0"/>
@@ -15719,6 +15835,9 @@
         </w:rPr>
       </w:pPr>
       <w:r>
+        <w:rPr>
+          <w:noProof/>
+        </w:rPr>
         <w:drawing>
           <wp:anchor distT="0" distB="0" distL="114300" distR="114300" simplePos="0" relativeHeight="251662336" behindDoc="1" locked="0" layoutInCell="1" allowOverlap="1" wp14:anchorId="71FEE06D" wp14:editId="5B778641">
             <wp:simplePos x="0" y="0"/>
@@ -15743,7 +15862,7 @@
                     <pic:cNvPicPr/>
                   </pic:nvPicPr>
                   <pic:blipFill>
-                    <a:blip r:embed="rId8" cstate="print">
+                    <a:blip r:embed="rId9" cstate="print">
                       <a:extLst>
                         <a:ext uri="{28A0092B-C50C-407E-A947-70E740481C1C}">
                           <a14:useLocalDpi xmlns:a14="http://schemas.microsoft.com/office/drawing/2010/main" val="0"/>
@@ -15799,6 +15918,9 @@
       </w:pPr>
       <w:bookmarkStart w:id="40" w:name="_Toc229012171"/>
       <w:r>
+        <w:rPr>
+          <w:noProof/>
+        </w:rPr>
         <w:drawing>
           <wp:anchor distT="0" distB="0" distL="114300" distR="114300" simplePos="0" relativeHeight="251663360" behindDoc="1" locked="0" layoutInCell="1" allowOverlap="1" wp14:anchorId="57A0A8BF" wp14:editId="75885DAD">
             <wp:simplePos x="0" y="0"/>
@@ -15823,7 +15945,7 @@
                     <pic:cNvPicPr/>
                   </pic:nvPicPr>
                   <pic:blipFill>
-                    <a:blip r:embed="rId9" cstate="print">
+                    <a:blip r:embed="rId10" cstate="print">
                       <a:extLst>
                         <a:ext uri="{28A0092B-C50C-407E-A947-70E740481C1C}">
                           <a14:useLocalDpi xmlns:a14="http://schemas.microsoft.com/office/drawing/2010/main" val="0"/>
@@ -15859,6 +15981,9 @@
         <w:br w:type="page"/>
       </w:r>
       <w:r>
+        <w:rPr>
+          <w:noProof/>
+        </w:rPr>
         <w:lastRenderedPageBreak/>
         <w:drawing>
           <wp:anchor distT="0" distB="0" distL="114300" distR="114300" simplePos="0" relativeHeight="251664384" behindDoc="1" locked="0" layoutInCell="1" allowOverlap="1" wp14:anchorId="2F978D0B" wp14:editId="1FF34B14">
@@ -15884,7 +16009,7 @@
                     <pic:cNvPicPr/>
                   </pic:nvPicPr>
                   <pic:blipFill>
-                    <a:blip r:embed="rId10" cstate="print">
+                    <a:blip r:embed="rId11" cstate="print">
                       <a:extLst>
                         <a:ext uri="{28A0092B-C50C-407E-A947-70E740481C1C}">
                           <a14:useLocalDpi xmlns:a14="http://schemas.microsoft.com/office/drawing/2010/main" val="0"/>
@@ -15935,6 +16060,9 @@
       </w:pPr>
       <w:bookmarkStart w:id="41" w:name="_Toc229012172"/>
       <w:r>
+        <w:rPr>
+          <w:noProof/>
+        </w:rPr>
         <w:lastRenderedPageBreak/>
         <w:drawing>
           <wp:anchor distT="0" distB="0" distL="114300" distR="114300" simplePos="0" relativeHeight="251665408" behindDoc="1" locked="0" layoutInCell="1" allowOverlap="1" wp14:anchorId="0646BCE6" wp14:editId="62A2B97B">
@@ -15960,7 +16088,7 @@
                     <pic:cNvPicPr/>
                   </pic:nvPicPr>
                   <pic:blipFill>
-                    <a:blip r:embed="rId11" cstate="print">
+                    <a:blip r:embed="rId12" cstate="print">
                       <a:extLst>
                         <a:ext uri="{28A0092B-C50C-407E-A947-70E740481C1C}">
                           <a14:useLocalDpi xmlns:a14="http://schemas.microsoft.com/office/drawing/2010/main" val="0"/>
@@ -19337,6 +19465,7 @@
   <w:style w:type="character" w:default="1" w:styleId="Fuentedeprrafopredeter">
     <w:name w:val="Default Paragraph Font"/>
     <w:uiPriority w:val="1"/>
+    <w:semiHidden/>
     <w:unhideWhenUsed/>
   </w:style>
   <w:style w:type="table" w:default="1" w:styleId="Tablanormal">
@@ -19899,6 +20028,18 @@
       <w:u w:val="single"/>
     </w:rPr>
   </w:style>
+  <w:style w:type="character" w:styleId="Mencinsinresolver">
+    <w:name w:val="Unresolved Mention"/>
+    <w:basedOn w:val="Fuentedeprrafopredeter"/>
+    <w:uiPriority w:val="99"/>
+    <w:semiHidden/>
+    <w:unhideWhenUsed/>
+    <w:rsid w:val="00DF7CF1"/>
+    <w:rPr>
+      <w:color w:val="605E5C"/>
+      <w:shd w:val="clear" w:color="auto" w:fill="E1DFDD"/>
+    </w:rPr>
+  </w:style>
 </w:styles>
 </file>
 

</xml_diff>